<commit_message>
Add ALP diagram to doc
</commit_message>
<xml_diff>
--- a/docs/Report/Application Level Protocol.docx
+++ b/docs/Report/Application Level Protocol.docx
@@ -1,6 +1,6 @@
 
 <file path=word/document.xml><?xml version="1.0" encoding="utf-8"?>
-<w:document xmlns:wpc="http://schemas.microsoft.com/office/word/2010/wordprocessingCanvas" xmlns:cx="http://schemas.microsoft.com/office/drawing/2014/chartex" xmlns:cx1="http://schemas.microsoft.com/office/drawing/2015/9/8/chartex" xmlns:cx2="http://schemas.microsoft.com/office/drawing/2015/10/21/chartex" xmlns:cx3="http://schemas.microsoft.com/office/drawing/2016/5/9/chartex" xmlns:cx4="http://schemas.microsoft.com/office/drawing/2016/5/10/chartex" xmlns:cx5="http://schemas.microsoft.com/office/drawing/2016/5/11/chartex" xmlns:cx6="http://schemas.microsoft.com/office/drawing/2016/5/12/chartex" xmlns:cx7="http://schemas.microsoft.com/office/drawing/2016/5/13/chartex" xmlns:cx8="http://schemas.microsoft.com/office/drawing/2016/5/14/chartex" xmlns:mc="http://schemas.openxmlformats.org/markup-compatibility/2006" xmlns:aink="http://schemas.microsoft.com/office/drawing/2016/ink" xmlns:am3d="http://schemas.microsoft.com/office/drawing/2017/model3d" xmlns:o="urn:schemas-microsoft-com:office:office" xmlns:oel="http://schemas.microsoft.com/office/2019/extlst" xmlns:r="http://schemas.openxmlformats.org/officeDocument/2006/relationships" xmlns:m="http://schemas.openxmlformats.org/officeDocument/2006/math" xmlns:v="urn:schemas-microsoft-com:vml" xmlns:wp14="http://schemas.microsoft.com/office/word/2010/wordprocessingDrawing" xmlns:wp="http://schemas.openxmlformats.org/drawingml/2006/wordprocessingDrawing" xmlns:w10="urn:schemas-microsoft-com:office:word" xmlns:w="http://schemas.openxmlformats.org/wordprocessingml/2006/main" xmlns:w14="http://schemas.microsoft.com/office/word/2010/wordml" xmlns:w15="http://schemas.microsoft.com/office/word/2012/wordml" xmlns:w16cex="http://schemas.microsoft.com/office/word/2018/wordml/cex" xmlns:w16cid="http://schemas.microsoft.com/office/word/2016/wordml/cid" xmlns:w16="http://schemas.microsoft.com/office/word/2018/wordml" xmlns:w16du="http://schemas.microsoft.com/office/word/2023/wordml/word16du" xmlns:w16sdtdh="http://schemas.microsoft.com/office/word/2020/wordml/sdtdatahash" xmlns:w16sdtfl="http://schemas.microsoft.com/office/word/2024/wordml/sdtformatlock" xmlns:w16se="http://schemas.microsoft.com/office/word/2015/wordml/symex" xmlns:wpg="http://schemas.microsoft.com/office/word/2010/wordprocessingGroup" xmlns:wpi="http://schemas.microsoft.com/office/word/2010/wordprocessingInk" xmlns:wne="http://schemas.microsoft.com/office/word/2006/wordml" xmlns:wps="http://schemas.microsoft.com/office/word/2010/wordprocessingShape" mc:Ignorable="w14 w15 w16se w16cid w16 w16cex w16sdtdh w16sdtfl w16du wp14">
+<w:document xmlns:wpc="http://schemas.microsoft.com/office/word/2010/wordprocessingCanvas" xmlns:cx="http://schemas.microsoft.com/office/drawing/2014/chartex" xmlns:cx1="http://schemas.microsoft.com/office/drawing/2015/9/8/chartex" xmlns:cx2="http://schemas.microsoft.com/office/drawing/2015/10/21/chartex" xmlns:cx3="http://schemas.microsoft.com/office/drawing/2016/5/9/chartex" xmlns:cx4="http://schemas.microsoft.com/office/drawing/2016/5/10/chartex" xmlns:cx5="http://schemas.microsoft.com/office/drawing/2016/5/11/chartex" xmlns:cx6="http://schemas.microsoft.com/office/drawing/2016/5/12/chartex" xmlns:cx7="http://schemas.microsoft.com/office/drawing/2016/5/13/chartex" xmlns:cx8="http://schemas.microsoft.com/office/drawing/2016/5/14/chartex" xmlns:mc="http://schemas.openxmlformats.org/markup-compatibility/2006" xmlns:aink="http://schemas.microsoft.com/office/drawing/2016/ink" xmlns:am3d="http://schemas.microsoft.com/office/drawing/2017/model3d" xmlns:o="urn:schemas-microsoft-com:office:office" xmlns:oel="http://schemas.microsoft.com/office/2019/extlst" xmlns:r="http://schemas.openxmlformats.org/officeDocument/2006/relationships" xmlns:m="http://schemas.openxmlformats.org/officeDocument/2006/math" xmlns:v="urn:schemas-microsoft-com:vml" xmlns:wp14="http://schemas.microsoft.com/office/word/2010/wordprocessingDrawing" xmlns:wp="http://schemas.openxmlformats.org/drawingml/2006/wordprocessingDrawing" xmlns:w10="urn:schemas-microsoft-com:office:word" xmlns:w="http://schemas.openxmlformats.org/wordprocessingml/2006/main" xmlns:w14="http://schemas.microsoft.com/office/word/2010/wordml" xmlns:w15="http://schemas.microsoft.com/office/word/2012/wordml" xmlns:w16cex="http://schemas.microsoft.com/office/word/2018/wordml/cex" xmlns:w16cid="http://schemas.microsoft.com/office/word/2016/wordml/cid" xmlns:w16="http://schemas.microsoft.com/office/word/2018/wordml" xmlns:w16du="http://schemas.microsoft.com/office/word/2023/wordml/word16du" xmlns:w16sdtdh="http://schemas.microsoft.com/office/word/2020/wordml/sdtdatahash" xmlns:w16se="http://schemas.microsoft.com/office/word/2015/wordml/symex" xmlns:wpg="http://schemas.microsoft.com/office/word/2010/wordprocessingGroup" xmlns:wpi="http://schemas.microsoft.com/office/word/2010/wordprocessingInk" xmlns:wne="http://schemas.microsoft.com/office/word/2006/wordml" xmlns:wps="http://schemas.microsoft.com/office/word/2010/wordprocessingShape" mc:Ignorable="w14 w15 w16se w16cid w16 w16cex w16sdtdh wp14">
   <w:body>
     <w:p>
       <w:pPr>
@@ -11,43 +11,82 @@
         <w:t xml:space="preserve">5. </w:t>
       </w:r>
       <w:r>
-        <w:t>Application Level Protocol</w:t>
+        <w:t>Application</w:t>
+      </w:r>
+      <w:r>
+        <w:rPr>
+          <w:rFonts w:hint="cs"/>
+          <w:rtl/>
+        </w:rPr>
+        <w:t>-</w:t>
+      </w:r>
+      <w:r>
+        <w:t>Level Protocol</w:t>
       </w:r>
       <w:bookmarkEnd w:id="0"/>
     </w:p>
+    <w:p/>
     <w:p>
       <w:pPr>
         <w:jc w:val="both"/>
       </w:pPr>
+      <w:r>
+        <w:rPr>
+          <w:noProof/>
+        </w:rPr>
+        <w:drawing>
+          <wp:inline distT="0" distB="0" distL="0" distR="0" wp14:anchorId="3068DFCC" wp14:editId="0E3768B8">
+            <wp:extent cx="5274310" cy="7021830"/>
+            <wp:effectExtent l="0" t="0" r="2540" b="7620"/>
+            <wp:docPr id="1" name="Picture 1"/>
+            <wp:cNvGraphicFramePr>
+              <a:graphicFrameLocks xmlns:a="http://schemas.openxmlformats.org/drawingml/2006/main" noChangeAspect="1"/>
+            </wp:cNvGraphicFramePr>
+            <a:graphic xmlns:a="http://schemas.openxmlformats.org/drawingml/2006/main">
+              <a:graphicData uri="http://schemas.openxmlformats.org/drawingml/2006/picture">
+                <pic:pic xmlns:pic="http://schemas.openxmlformats.org/drawingml/2006/picture">
+                  <pic:nvPicPr>
+                    <pic:cNvPr id="0" name="Picture 1"/>
+                    <pic:cNvPicPr>
+                      <a:picLocks noChangeAspect="1" noChangeArrowheads="1"/>
+                    </pic:cNvPicPr>
+                  </pic:nvPicPr>
+                  <pic:blipFill>
+                    <a:blip r:embed="rId7">
+                      <a:extLst>
+                        <a:ext uri="{28A0092B-C50C-407E-A947-70E740481C1C}">
+                          <a14:useLocalDpi xmlns:a14="http://schemas.microsoft.com/office/drawing/2010/main" val="0"/>
+                        </a:ext>
+                      </a:extLst>
+                    </a:blip>
+                    <a:srcRect/>
+                    <a:stretch>
+                      <a:fillRect/>
+                    </a:stretch>
+                  </pic:blipFill>
+                  <pic:spPr bwMode="auto">
+                    <a:xfrm>
+                      <a:off x="0" y="0"/>
+                      <a:ext cx="5274310" cy="7021830"/>
+                    </a:xfrm>
+                    <a:prstGeom prst="rect">
+                      <a:avLst/>
+                    </a:prstGeom>
+                    <a:noFill/>
+                    <a:ln>
+                      <a:noFill/>
+                    </a:ln>
+                  </pic:spPr>
+                </pic:pic>
+              </a:graphicData>
+            </a:graphic>
+          </wp:inline>
+        </w:drawing>
+      </w:r>
     </w:p>
     <w:p>
       <w:pPr>
         <w:jc w:val="both"/>
-      </w:pPr>
-    </w:p>
-    <w:p>
-      <w:pPr>
-        <w:jc w:val="both"/>
-      </w:pPr>
-    </w:p>
-    <w:p>
-      <w:pPr>
-        <w:jc w:val="both"/>
-        <w:sectPr>
-          <w:footerReference w:type="default" r:id="rId7"/>
-          <w:pgSz w:w="11906" w:h="16838"/>
-          <w:pgMar w:top="1440" w:right="1800" w:bottom="1440" w:left="1800" w:header="720" w:footer="720" w:gutter="0"/>
-          <w:pgBorders w:offsetFrom="page">
-            <w:top w:val="thinThickSmallGap" w:sz="24" w:space="24" w:color="auto"/>
-            <w:left w:val="thinThickSmallGap" w:sz="24" w:space="24" w:color="auto"/>
-            <w:bottom w:val="thickThinSmallGap" w:sz="24" w:space="24" w:color="auto"/>
-            <w:right w:val="thickThinSmallGap" w:sz="24" w:space="24" w:color="auto"/>
-          </w:pgBorders>
-          <w:cols w:space="720"/>
-          <w:bidi/>
-          <w:rtlGutter/>
-          <w:docGrid w:linePitch="360"/>
-        </w:sectPr>
       </w:pPr>
     </w:p>
     <w:p>
@@ -75,7 +114,7 @@
 </file>
 
 <file path=word/endnotes.xml><?xml version="1.0" encoding="utf-8"?>
-<w:endnotes xmlns:wpc="http://schemas.microsoft.com/office/word/2010/wordprocessingCanvas" xmlns:cx="http://schemas.microsoft.com/office/drawing/2014/chartex" xmlns:cx1="http://schemas.microsoft.com/office/drawing/2015/9/8/chartex" xmlns:cx2="http://schemas.microsoft.com/office/drawing/2015/10/21/chartex" xmlns:cx3="http://schemas.microsoft.com/office/drawing/2016/5/9/chartex" xmlns:cx4="http://schemas.microsoft.com/office/drawing/2016/5/10/chartex" xmlns:cx5="http://schemas.microsoft.com/office/drawing/2016/5/11/chartex" xmlns:cx6="http://schemas.microsoft.com/office/drawing/2016/5/12/chartex" xmlns:cx7="http://schemas.microsoft.com/office/drawing/2016/5/13/chartex" xmlns:cx8="http://schemas.microsoft.com/office/drawing/2016/5/14/chartex" xmlns:mc="http://schemas.openxmlformats.org/markup-compatibility/2006" xmlns:aink="http://schemas.microsoft.com/office/drawing/2016/ink" xmlns:am3d="http://schemas.microsoft.com/office/drawing/2017/model3d" xmlns:o="urn:schemas-microsoft-com:office:office" xmlns:oel="http://schemas.microsoft.com/office/2019/extlst" xmlns:r="http://schemas.openxmlformats.org/officeDocument/2006/relationships" xmlns:m="http://schemas.openxmlformats.org/officeDocument/2006/math" xmlns:v="urn:schemas-microsoft-com:vml" xmlns:wp14="http://schemas.microsoft.com/office/word/2010/wordprocessingDrawing" xmlns:wp="http://schemas.openxmlformats.org/drawingml/2006/wordprocessingDrawing" xmlns:w10="urn:schemas-microsoft-com:office:word" xmlns:w="http://schemas.openxmlformats.org/wordprocessingml/2006/main" xmlns:w14="http://schemas.microsoft.com/office/word/2010/wordml" xmlns:w15="http://schemas.microsoft.com/office/word/2012/wordml" xmlns:w16cex="http://schemas.microsoft.com/office/word/2018/wordml/cex" xmlns:w16cid="http://schemas.microsoft.com/office/word/2016/wordml/cid" xmlns:w16="http://schemas.microsoft.com/office/word/2018/wordml" xmlns:w16du="http://schemas.microsoft.com/office/word/2023/wordml/word16du" xmlns:w16sdtdh="http://schemas.microsoft.com/office/word/2020/wordml/sdtdatahash" xmlns:w16sdtfl="http://schemas.microsoft.com/office/word/2024/wordml/sdtformatlock" xmlns:w16se="http://schemas.microsoft.com/office/word/2015/wordml/symex" xmlns:wpg="http://schemas.microsoft.com/office/word/2010/wordprocessingGroup" xmlns:wpi="http://schemas.microsoft.com/office/word/2010/wordprocessingInk" xmlns:wne="http://schemas.microsoft.com/office/word/2006/wordml" xmlns:wps="http://schemas.microsoft.com/office/word/2010/wordprocessingShape" mc:Ignorable="w14 w15 w16se w16cid w16 w16cex w16sdtdh w16sdtfl w16du wp14">
+<w:endnotes xmlns:wpc="http://schemas.microsoft.com/office/word/2010/wordprocessingCanvas" xmlns:cx="http://schemas.microsoft.com/office/drawing/2014/chartex" xmlns:cx1="http://schemas.microsoft.com/office/drawing/2015/9/8/chartex" xmlns:cx2="http://schemas.microsoft.com/office/drawing/2015/10/21/chartex" xmlns:cx3="http://schemas.microsoft.com/office/drawing/2016/5/9/chartex" xmlns:cx4="http://schemas.microsoft.com/office/drawing/2016/5/10/chartex" xmlns:cx5="http://schemas.microsoft.com/office/drawing/2016/5/11/chartex" xmlns:cx6="http://schemas.microsoft.com/office/drawing/2016/5/12/chartex" xmlns:cx7="http://schemas.microsoft.com/office/drawing/2016/5/13/chartex" xmlns:cx8="http://schemas.microsoft.com/office/drawing/2016/5/14/chartex" xmlns:mc="http://schemas.openxmlformats.org/markup-compatibility/2006" xmlns:aink="http://schemas.microsoft.com/office/drawing/2016/ink" xmlns:am3d="http://schemas.microsoft.com/office/drawing/2017/model3d" xmlns:o="urn:schemas-microsoft-com:office:office" xmlns:oel="http://schemas.microsoft.com/office/2019/extlst" xmlns:r="http://schemas.openxmlformats.org/officeDocument/2006/relationships" xmlns:m="http://schemas.openxmlformats.org/officeDocument/2006/math" xmlns:v="urn:schemas-microsoft-com:vml" xmlns:wp14="http://schemas.microsoft.com/office/word/2010/wordprocessingDrawing" xmlns:wp="http://schemas.openxmlformats.org/drawingml/2006/wordprocessingDrawing" xmlns:w10="urn:schemas-microsoft-com:office:word" xmlns:w="http://schemas.openxmlformats.org/wordprocessingml/2006/main" xmlns:w14="http://schemas.microsoft.com/office/word/2010/wordml" xmlns:w15="http://schemas.microsoft.com/office/word/2012/wordml" xmlns:w16cex="http://schemas.microsoft.com/office/word/2018/wordml/cex" xmlns:w16cid="http://schemas.microsoft.com/office/word/2016/wordml/cid" xmlns:w16="http://schemas.microsoft.com/office/word/2018/wordml" xmlns:w16du="http://schemas.microsoft.com/office/word/2023/wordml/word16du" xmlns:w16sdtdh="http://schemas.microsoft.com/office/word/2020/wordml/sdtdatahash" xmlns:w16se="http://schemas.microsoft.com/office/word/2015/wordml/symex" xmlns:wpg="http://schemas.microsoft.com/office/word/2010/wordprocessingGroup" xmlns:wpi="http://schemas.microsoft.com/office/word/2010/wordprocessingInk" xmlns:wne="http://schemas.microsoft.com/office/word/2006/wordml" xmlns:wps="http://schemas.microsoft.com/office/word/2010/wordprocessingShape" mc:Ignorable="w14 w15 w16se w16cid w16 w16cex w16sdtdh wp14">
   <w:endnote w:type="separator" w:id="-1">
     <w:p>
       <w:pPr>
@@ -100,61 +139,7 @@
 </file>
 
 <file path=word/footer1.xml><?xml version="1.0" encoding="utf-8"?>
-<w:ftr xmlns:wpc="http://schemas.microsoft.com/office/word/2010/wordprocessingCanvas" xmlns:cx="http://schemas.microsoft.com/office/drawing/2014/chartex" xmlns:cx1="http://schemas.microsoft.com/office/drawing/2015/9/8/chartex" xmlns:cx2="http://schemas.microsoft.com/office/drawing/2015/10/21/chartex" xmlns:cx3="http://schemas.microsoft.com/office/drawing/2016/5/9/chartex" xmlns:cx4="http://schemas.microsoft.com/office/drawing/2016/5/10/chartex" xmlns:cx5="http://schemas.microsoft.com/office/drawing/2016/5/11/chartex" xmlns:cx6="http://schemas.microsoft.com/office/drawing/2016/5/12/chartex" xmlns:cx7="http://schemas.microsoft.com/office/drawing/2016/5/13/chartex" xmlns:cx8="http://schemas.microsoft.com/office/drawing/2016/5/14/chartex" xmlns:mc="http://schemas.openxmlformats.org/markup-compatibility/2006" xmlns:aink="http://schemas.microsoft.com/office/drawing/2016/ink" xmlns:am3d="http://schemas.microsoft.com/office/drawing/2017/model3d" xmlns:o="urn:schemas-microsoft-com:office:office" xmlns:oel="http://schemas.microsoft.com/office/2019/extlst" xmlns:r="http://schemas.openxmlformats.org/officeDocument/2006/relationships" xmlns:m="http://schemas.openxmlformats.org/officeDocument/2006/math" xmlns:v="urn:schemas-microsoft-com:vml" xmlns:wp14="http://schemas.microsoft.com/office/word/2010/wordprocessingDrawing" xmlns:wp="http://schemas.openxmlformats.org/drawingml/2006/wordprocessingDrawing" xmlns:w10="urn:schemas-microsoft-com:office:word" xmlns:w="http://schemas.openxmlformats.org/wordprocessingml/2006/main" xmlns:w14="http://schemas.microsoft.com/office/word/2010/wordml" xmlns:w15="http://schemas.microsoft.com/office/word/2012/wordml" xmlns:w16cex="http://schemas.microsoft.com/office/word/2018/wordml/cex" xmlns:w16cid="http://schemas.microsoft.com/office/word/2016/wordml/cid" xmlns:w16="http://schemas.microsoft.com/office/word/2018/wordml" xmlns:w16du="http://schemas.microsoft.com/office/word/2023/wordml/word16du" xmlns:w16sdtdh="http://schemas.microsoft.com/office/word/2020/wordml/sdtdatahash" xmlns:w16sdtfl="http://schemas.microsoft.com/office/word/2024/wordml/sdtformatlock" xmlns:w16se="http://schemas.microsoft.com/office/word/2015/wordml/symex" xmlns:wpg="http://schemas.microsoft.com/office/word/2010/wordprocessingGroup" xmlns:wpi="http://schemas.microsoft.com/office/word/2010/wordprocessingInk" xmlns:wne="http://schemas.microsoft.com/office/word/2006/wordml" xmlns:wps="http://schemas.microsoft.com/office/word/2010/wordprocessingShape" mc:Ignorable="w14 w15 w16se w16cid w16 w16cex w16sdtdh w16sdtfl w16du wp14">
-  <w:sdt>
-    <w:sdtPr>
-      <w:id w:val="82972924"/>
-      <w:docPartObj>
-        <w:docPartGallery w:val="Page Numbers (Bottom of Page)"/>
-        <w:docPartUnique/>
-      </w:docPartObj>
-    </w:sdtPr>
-    <w:sdtContent>
-      <w:p>
-        <w:pPr>
-          <w:pStyle w:val="Footer"/>
-          <w:jc w:val="right"/>
-        </w:pPr>
-        <w:r>
-          <w:t xml:space="preserve">Page | </w:t>
-        </w:r>
-        <w:r>
-          <w:fldChar w:fldCharType="begin"/>
-        </w:r>
-        <w:r>
-          <w:instrText xml:space="preserve"> PAGE   \* MERGEFORMAT </w:instrText>
-        </w:r>
-        <w:r>
-          <w:fldChar w:fldCharType="separate"/>
-        </w:r>
-        <w:r>
-          <w:rPr>
-            <w:noProof/>
-          </w:rPr>
-          <w:t>2</w:t>
-        </w:r>
-        <w:r>
-          <w:rPr>
-            <w:noProof/>
-          </w:rPr>
-          <w:fldChar w:fldCharType="end"/>
-        </w:r>
-        <w:r>
-          <w:t xml:space="preserve"> </w:t>
-        </w:r>
-      </w:p>
-    </w:sdtContent>
-  </w:sdt>
-  <w:p>
-    <w:pPr>
-      <w:pStyle w:val="Footer"/>
-    </w:pPr>
-  </w:p>
-</w:ftr>
-</file>
-
-<file path=word/footer2.xml><?xml version="1.0" encoding="utf-8"?>
-<w:ftr xmlns:wpc="http://schemas.microsoft.com/office/word/2010/wordprocessingCanvas" xmlns:cx="http://schemas.microsoft.com/office/drawing/2014/chartex" xmlns:cx1="http://schemas.microsoft.com/office/drawing/2015/9/8/chartex" xmlns:cx2="http://schemas.microsoft.com/office/drawing/2015/10/21/chartex" xmlns:cx3="http://schemas.microsoft.com/office/drawing/2016/5/9/chartex" xmlns:cx4="http://schemas.microsoft.com/office/drawing/2016/5/10/chartex" xmlns:cx5="http://schemas.microsoft.com/office/drawing/2016/5/11/chartex" xmlns:cx6="http://schemas.microsoft.com/office/drawing/2016/5/12/chartex" xmlns:cx7="http://schemas.microsoft.com/office/drawing/2016/5/13/chartex" xmlns:cx8="http://schemas.microsoft.com/office/drawing/2016/5/14/chartex" xmlns:mc="http://schemas.openxmlformats.org/markup-compatibility/2006" xmlns:aink="http://schemas.microsoft.com/office/drawing/2016/ink" xmlns:am3d="http://schemas.microsoft.com/office/drawing/2017/model3d" xmlns:o="urn:schemas-microsoft-com:office:office" xmlns:oel="http://schemas.microsoft.com/office/2019/extlst" xmlns:r="http://schemas.openxmlformats.org/officeDocument/2006/relationships" xmlns:m="http://schemas.openxmlformats.org/officeDocument/2006/math" xmlns:v="urn:schemas-microsoft-com:vml" xmlns:wp14="http://schemas.microsoft.com/office/word/2010/wordprocessingDrawing" xmlns:wp="http://schemas.openxmlformats.org/drawingml/2006/wordprocessingDrawing" xmlns:w10="urn:schemas-microsoft-com:office:word" xmlns:w="http://schemas.openxmlformats.org/wordprocessingml/2006/main" xmlns:w14="http://schemas.microsoft.com/office/word/2010/wordml" xmlns:w15="http://schemas.microsoft.com/office/word/2012/wordml" xmlns:w16cex="http://schemas.microsoft.com/office/word/2018/wordml/cex" xmlns:w16cid="http://schemas.microsoft.com/office/word/2016/wordml/cid" xmlns:w16="http://schemas.microsoft.com/office/word/2018/wordml" xmlns:w16du="http://schemas.microsoft.com/office/word/2023/wordml/word16du" xmlns:w16sdtdh="http://schemas.microsoft.com/office/word/2020/wordml/sdtdatahash" xmlns:w16sdtfl="http://schemas.microsoft.com/office/word/2024/wordml/sdtformatlock" xmlns:w16se="http://schemas.microsoft.com/office/word/2015/wordml/symex" xmlns:wpg="http://schemas.microsoft.com/office/word/2010/wordprocessingGroup" xmlns:wpi="http://schemas.microsoft.com/office/word/2010/wordprocessingInk" xmlns:wne="http://schemas.microsoft.com/office/word/2006/wordml" xmlns:wps="http://schemas.microsoft.com/office/word/2010/wordprocessingShape" mc:Ignorable="w14 w15 w16se w16cid w16 w16cex w16sdtdh w16sdtfl w16du wp14">
+<w:ftr xmlns:wpc="http://schemas.microsoft.com/office/word/2010/wordprocessingCanvas" xmlns:cx="http://schemas.microsoft.com/office/drawing/2014/chartex" xmlns:cx1="http://schemas.microsoft.com/office/drawing/2015/9/8/chartex" xmlns:cx2="http://schemas.microsoft.com/office/drawing/2015/10/21/chartex" xmlns:cx3="http://schemas.microsoft.com/office/drawing/2016/5/9/chartex" xmlns:cx4="http://schemas.microsoft.com/office/drawing/2016/5/10/chartex" xmlns:cx5="http://schemas.microsoft.com/office/drawing/2016/5/11/chartex" xmlns:cx6="http://schemas.microsoft.com/office/drawing/2016/5/12/chartex" xmlns:cx7="http://schemas.microsoft.com/office/drawing/2016/5/13/chartex" xmlns:cx8="http://schemas.microsoft.com/office/drawing/2016/5/14/chartex" xmlns:mc="http://schemas.openxmlformats.org/markup-compatibility/2006" xmlns:aink="http://schemas.microsoft.com/office/drawing/2016/ink" xmlns:am3d="http://schemas.microsoft.com/office/drawing/2017/model3d" xmlns:o="urn:schemas-microsoft-com:office:office" xmlns:oel="http://schemas.microsoft.com/office/2019/extlst" xmlns:r="http://schemas.openxmlformats.org/officeDocument/2006/relationships" xmlns:m="http://schemas.openxmlformats.org/officeDocument/2006/math" xmlns:v="urn:schemas-microsoft-com:vml" xmlns:wp14="http://schemas.microsoft.com/office/word/2010/wordprocessingDrawing" xmlns:wp="http://schemas.openxmlformats.org/drawingml/2006/wordprocessingDrawing" xmlns:w10="urn:schemas-microsoft-com:office:word" xmlns:w="http://schemas.openxmlformats.org/wordprocessingml/2006/main" xmlns:w14="http://schemas.microsoft.com/office/word/2010/wordml" xmlns:w15="http://schemas.microsoft.com/office/word/2012/wordml" xmlns:w16cex="http://schemas.microsoft.com/office/word/2018/wordml/cex" xmlns:w16cid="http://schemas.microsoft.com/office/word/2016/wordml/cid" xmlns:w16="http://schemas.microsoft.com/office/word/2018/wordml" xmlns:w16du="http://schemas.microsoft.com/office/word/2023/wordml/word16du" xmlns:w16sdtdh="http://schemas.microsoft.com/office/word/2020/wordml/sdtdatahash" xmlns:w16se="http://schemas.microsoft.com/office/word/2015/wordml/symex" xmlns:wpg="http://schemas.microsoft.com/office/word/2010/wordprocessingGroup" xmlns:wpi="http://schemas.microsoft.com/office/word/2010/wordprocessingInk" xmlns:wne="http://schemas.microsoft.com/office/word/2006/wordml" xmlns:wps="http://schemas.microsoft.com/office/word/2010/wordprocessingShape" mc:Ignorable="w14 w15 w16se w16cid w16 w16cex w16sdtdh wp14">
   <w:sdt>
     <w:sdtPr>
       <w:id w:val="-809625296"/>
@@ -208,7 +193,7 @@
 </file>
 
 <file path=word/footnotes.xml><?xml version="1.0" encoding="utf-8"?>
-<w:footnotes xmlns:wpc="http://schemas.microsoft.com/office/word/2010/wordprocessingCanvas" xmlns:cx="http://schemas.microsoft.com/office/drawing/2014/chartex" xmlns:cx1="http://schemas.microsoft.com/office/drawing/2015/9/8/chartex" xmlns:cx2="http://schemas.microsoft.com/office/drawing/2015/10/21/chartex" xmlns:cx3="http://schemas.microsoft.com/office/drawing/2016/5/9/chartex" xmlns:cx4="http://schemas.microsoft.com/office/drawing/2016/5/10/chartex" xmlns:cx5="http://schemas.microsoft.com/office/drawing/2016/5/11/chartex" xmlns:cx6="http://schemas.microsoft.com/office/drawing/2016/5/12/chartex" xmlns:cx7="http://schemas.microsoft.com/office/drawing/2016/5/13/chartex" xmlns:cx8="http://schemas.microsoft.com/office/drawing/2016/5/14/chartex" xmlns:mc="http://schemas.openxmlformats.org/markup-compatibility/2006" xmlns:aink="http://schemas.microsoft.com/office/drawing/2016/ink" xmlns:am3d="http://schemas.microsoft.com/office/drawing/2017/model3d" xmlns:o="urn:schemas-microsoft-com:office:office" xmlns:oel="http://schemas.microsoft.com/office/2019/extlst" xmlns:r="http://schemas.openxmlformats.org/officeDocument/2006/relationships" xmlns:m="http://schemas.openxmlformats.org/officeDocument/2006/math" xmlns:v="urn:schemas-microsoft-com:vml" xmlns:wp14="http://schemas.microsoft.com/office/word/2010/wordprocessingDrawing" xmlns:wp="http://schemas.openxmlformats.org/drawingml/2006/wordprocessingDrawing" xmlns:w10="urn:schemas-microsoft-com:office:word" xmlns:w="http://schemas.openxmlformats.org/wordprocessingml/2006/main" xmlns:w14="http://schemas.microsoft.com/office/word/2010/wordml" xmlns:w15="http://schemas.microsoft.com/office/word/2012/wordml" xmlns:w16cex="http://schemas.microsoft.com/office/word/2018/wordml/cex" xmlns:w16cid="http://schemas.microsoft.com/office/word/2016/wordml/cid" xmlns:w16="http://schemas.microsoft.com/office/word/2018/wordml" xmlns:w16du="http://schemas.microsoft.com/office/word/2023/wordml/word16du" xmlns:w16sdtdh="http://schemas.microsoft.com/office/word/2020/wordml/sdtdatahash" xmlns:w16sdtfl="http://schemas.microsoft.com/office/word/2024/wordml/sdtformatlock" xmlns:w16se="http://schemas.microsoft.com/office/word/2015/wordml/symex" xmlns:wpg="http://schemas.microsoft.com/office/word/2010/wordprocessingGroup" xmlns:wpi="http://schemas.microsoft.com/office/word/2010/wordprocessingInk" xmlns:wne="http://schemas.microsoft.com/office/word/2006/wordml" xmlns:wps="http://schemas.microsoft.com/office/word/2010/wordprocessingShape" mc:Ignorable="w14 w15 w16se w16cid w16 w16cex w16sdtdh w16sdtfl w16du wp14">
+<w:footnotes xmlns:wpc="http://schemas.microsoft.com/office/word/2010/wordprocessingCanvas" xmlns:cx="http://schemas.microsoft.com/office/drawing/2014/chartex" xmlns:cx1="http://schemas.microsoft.com/office/drawing/2015/9/8/chartex" xmlns:cx2="http://schemas.microsoft.com/office/drawing/2015/10/21/chartex" xmlns:cx3="http://schemas.microsoft.com/office/drawing/2016/5/9/chartex" xmlns:cx4="http://schemas.microsoft.com/office/drawing/2016/5/10/chartex" xmlns:cx5="http://schemas.microsoft.com/office/drawing/2016/5/11/chartex" xmlns:cx6="http://schemas.microsoft.com/office/drawing/2016/5/12/chartex" xmlns:cx7="http://schemas.microsoft.com/office/drawing/2016/5/13/chartex" xmlns:cx8="http://schemas.microsoft.com/office/drawing/2016/5/14/chartex" xmlns:mc="http://schemas.openxmlformats.org/markup-compatibility/2006" xmlns:aink="http://schemas.microsoft.com/office/drawing/2016/ink" xmlns:am3d="http://schemas.microsoft.com/office/drawing/2017/model3d" xmlns:o="urn:schemas-microsoft-com:office:office" xmlns:oel="http://schemas.microsoft.com/office/2019/extlst" xmlns:r="http://schemas.openxmlformats.org/officeDocument/2006/relationships" xmlns:m="http://schemas.openxmlformats.org/officeDocument/2006/math" xmlns:v="urn:schemas-microsoft-com:vml" xmlns:wp14="http://schemas.microsoft.com/office/word/2010/wordprocessingDrawing" xmlns:wp="http://schemas.openxmlformats.org/drawingml/2006/wordprocessingDrawing" xmlns:w10="urn:schemas-microsoft-com:office:word" xmlns:w="http://schemas.openxmlformats.org/wordprocessingml/2006/main" xmlns:w14="http://schemas.microsoft.com/office/word/2010/wordml" xmlns:w15="http://schemas.microsoft.com/office/word/2012/wordml" xmlns:w16cex="http://schemas.microsoft.com/office/word/2018/wordml/cex" xmlns:w16cid="http://schemas.microsoft.com/office/word/2016/wordml/cid" xmlns:w16="http://schemas.microsoft.com/office/word/2018/wordml" xmlns:w16du="http://schemas.microsoft.com/office/word/2023/wordml/word16du" xmlns:w16sdtdh="http://schemas.microsoft.com/office/word/2020/wordml/sdtdatahash" xmlns:w16se="http://schemas.microsoft.com/office/word/2015/wordml/symex" xmlns:wpg="http://schemas.microsoft.com/office/word/2010/wordprocessingGroup" xmlns:wpi="http://schemas.microsoft.com/office/word/2010/wordprocessingInk" xmlns:wne="http://schemas.microsoft.com/office/word/2006/wordml" xmlns:wps="http://schemas.microsoft.com/office/word/2010/wordprocessingShape" mc:Ignorable="w14 w15 w16se w16cid w16 w16cex w16sdtdh wp14">
   <w:footnote w:type="separator" w:id="-1">
     <w:p>
       <w:pPr>
@@ -233,7 +218,7 @@
 </file>
 
 <file path=word/numbering.xml><?xml version="1.0" encoding="utf-8"?>
-<w:numbering xmlns:wpc="http://schemas.microsoft.com/office/word/2010/wordprocessingCanvas" xmlns:cx="http://schemas.microsoft.com/office/drawing/2014/chartex" xmlns:cx1="http://schemas.microsoft.com/office/drawing/2015/9/8/chartex" xmlns:cx2="http://schemas.microsoft.com/office/drawing/2015/10/21/chartex" xmlns:cx3="http://schemas.microsoft.com/office/drawing/2016/5/9/chartex" xmlns:cx4="http://schemas.microsoft.com/office/drawing/2016/5/10/chartex" xmlns:cx5="http://schemas.microsoft.com/office/drawing/2016/5/11/chartex" xmlns:cx6="http://schemas.microsoft.com/office/drawing/2016/5/12/chartex" xmlns:cx7="http://schemas.microsoft.com/office/drawing/2016/5/13/chartex" xmlns:cx8="http://schemas.microsoft.com/office/drawing/2016/5/14/chartex" xmlns:mc="http://schemas.openxmlformats.org/markup-compatibility/2006" xmlns:aink="http://schemas.microsoft.com/office/drawing/2016/ink" xmlns:am3d="http://schemas.microsoft.com/office/drawing/2017/model3d" xmlns:o="urn:schemas-microsoft-com:office:office" xmlns:oel="http://schemas.microsoft.com/office/2019/extlst" xmlns:r="http://schemas.openxmlformats.org/officeDocument/2006/relationships" xmlns:m="http://schemas.openxmlformats.org/officeDocument/2006/math" xmlns:v="urn:schemas-microsoft-com:vml" xmlns:wp14="http://schemas.microsoft.com/office/word/2010/wordprocessingDrawing" xmlns:wp="http://schemas.openxmlformats.org/drawingml/2006/wordprocessingDrawing" xmlns:w10="urn:schemas-microsoft-com:office:word" xmlns:w="http://schemas.openxmlformats.org/wordprocessingml/2006/main" xmlns:w14="http://schemas.microsoft.com/office/word/2010/wordml" xmlns:w15="http://schemas.microsoft.com/office/word/2012/wordml" xmlns:w16cex="http://schemas.microsoft.com/office/word/2018/wordml/cex" xmlns:w16cid="http://schemas.microsoft.com/office/word/2016/wordml/cid" xmlns:w16="http://schemas.microsoft.com/office/word/2018/wordml" xmlns:w16du="http://schemas.microsoft.com/office/word/2023/wordml/word16du" xmlns:w16sdtdh="http://schemas.microsoft.com/office/word/2020/wordml/sdtdatahash" xmlns:w16sdtfl="http://schemas.microsoft.com/office/word/2024/wordml/sdtformatlock" xmlns:w16se="http://schemas.microsoft.com/office/word/2015/wordml/symex" xmlns:wpg="http://schemas.microsoft.com/office/word/2010/wordprocessingGroup" xmlns:wpi="http://schemas.microsoft.com/office/word/2010/wordprocessingInk" xmlns:wne="http://schemas.microsoft.com/office/word/2006/wordml" xmlns:wps="http://schemas.microsoft.com/office/word/2010/wordprocessingShape" mc:Ignorable="w14 w15 w16se w16cid w16 w16cex w16sdtdh w16sdtfl w16du wp14">
+<w:numbering xmlns:wpc="http://schemas.microsoft.com/office/word/2010/wordprocessingCanvas" xmlns:cx="http://schemas.microsoft.com/office/drawing/2014/chartex" xmlns:cx1="http://schemas.microsoft.com/office/drawing/2015/9/8/chartex" xmlns:cx2="http://schemas.microsoft.com/office/drawing/2015/10/21/chartex" xmlns:cx3="http://schemas.microsoft.com/office/drawing/2016/5/9/chartex" xmlns:cx4="http://schemas.microsoft.com/office/drawing/2016/5/10/chartex" xmlns:cx5="http://schemas.microsoft.com/office/drawing/2016/5/11/chartex" xmlns:cx6="http://schemas.microsoft.com/office/drawing/2016/5/12/chartex" xmlns:cx7="http://schemas.microsoft.com/office/drawing/2016/5/13/chartex" xmlns:cx8="http://schemas.microsoft.com/office/drawing/2016/5/14/chartex" xmlns:mc="http://schemas.openxmlformats.org/markup-compatibility/2006" xmlns:aink="http://schemas.microsoft.com/office/drawing/2016/ink" xmlns:am3d="http://schemas.microsoft.com/office/drawing/2017/model3d" xmlns:o="urn:schemas-microsoft-com:office:office" xmlns:oel="http://schemas.microsoft.com/office/2019/extlst" xmlns:r="http://schemas.openxmlformats.org/officeDocument/2006/relationships" xmlns:m="http://schemas.openxmlformats.org/officeDocument/2006/math" xmlns:v="urn:schemas-microsoft-com:vml" xmlns:wp14="http://schemas.microsoft.com/office/word/2010/wordprocessingDrawing" xmlns:wp="http://schemas.openxmlformats.org/drawingml/2006/wordprocessingDrawing" xmlns:w10="urn:schemas-microsoft-com:office:word" xmlns:w="http://schemas.openxmlformats.org/wordprocessingml/2006/main" xmlns:w14="http://schemas.microsoft.com/office/word/2010/wordml" xmlns:w15="http://schemas.microsoft.com/office/word/2012/wordml" xmlns:w16cex="http://schemas.microsoft.com/office/word/2018/wordml/cex" xmlns:w16cid="http://schemas.microsoft.com/office/word/2016/wordml/cid" xmlns:w16="http://schemas.microsoft.com/office/word/2018/wordml" xmlns:w16du="http://schemas.microsoft.com/office/word/2023/wordml/word16du" xmlns:w16sdtdh="http://schemas.microsoft.com/office/word/2020/wordml/sdtdatahash" xmlns:w16se="http://schemas.microsoft.com/office/word/2015/wordml/symex" xmlns:wpg="http://schemas.microsoft.com/office/word/2010/wordprocessingGroup" xmlns:wpi="http://schemas.microsoft.com/office/word/2010/wordprocessingInk" xmlns:wne="http://schemas.microsoft.com/office/word/2006/wordml" xmlns:wps="http://schemas.microsoft.com/office/word/2010/wordprocessingShape" mc:Ignorable="w14 w15 w16se w16cid w16 w16cex w16sdtdh wp14">
   <w:abstractNum w:abstractNumId="0" w15:restartNumberingAfterBreak="0">
     <w:nsid w:val="07D81549"/>
     <w:multiLevelType w:val="hybridMultilevel"/>
@@ -740,7 +725,7 @@
 </file>
 
 <file path=word/styles.xml><?xml version="1.0" encoding="utf-8"?>
-<w:styles xmlns:mc="http://schemas.openxmlformats.org/markup-compatibility/2006" xmlns:r="http://schemas.openxmlformats.org/officeDocument/2006/relationships" xmlns:w="http://schemas.openxmlformats.org/wordprocessingml/2006/main" xmlns:w14="http://schemas.microsoft.com/office/word/2010/wordml" xmlns:w15="http://schemas.microsoft.com/office/word/2012/wordml" xmlns:w16cex="http://schemas.microsoft.com/office/word/2018/wordml/cex" xmlns:w16cid="http://schemas.microsoft.com/office/word/2016/wordml/cid" xmlns:w16="http://schemas.microsoft.com/office/word/2018/wordml" xmlns:w16du="http://schemas.microsoft.com/office/word/2023/wordml/word16du" xmlns:w16sdtdh="http://schemas.microsoft.com/office/word/2020/wordml/sdtdatahash" xmlns:w16sdtfl="http://schemas.microsoft.com/office/word/2024/wordml/sdtformatlock" xmlns:w16se="http://schemas.microsoft.com/office/word/2015/wordml/symex" mc:Ignorable="w14 w15 w16se w16cid w16 w16cex w16sdtdh w16sdtfl w16du">
+<w:styles xmlns:mc="http://schemas.openxmlformats.org/markup-compatibility/2006" xmlns:r="http://schemas.openxmlformats.org/officeDocument/2006/relationships" xmlns:w="http://schemas.openxmlformats.org/wordprocessingml/2006/main" xmlns:w14="http://schemas.microsoft.com/office/word/2010/wordml" xmlns:w15="http://schemas.microsoft.com/office/word/2012/wordml" xmlns:w16cex="http://schemas.microsoft.com/office/word/2018/wordml/cex" xmlns:w16cid="http://schemas.microsoft.com/office/word/2016/wordml/cid" xmlns:w16="http://schemas.microsoft.com/office/word/2018/wordml" xmlns:w16sdtdh="http://schemas.microsoft.com/office/word/2020/wordml/sdtdatahash" xmlns:w16se="http://schemas.microsoft.com/office/word/2015/wordml/symex" mc:Ignorable="w14 w15 w16se w16cid w16 w16cex w16sdtdh">
   <w:docDefaults>
     <w:rPrDefault>
       <w:rPr>

</xml_diff>